<commit_message>
use Symbol/Wingdings font glyphs and contextual spacing
  Bullet levels were emitting U+25CF/U+25CB/U+25A0 with an Ascii=Symbol
  font override — the Symbol font has no glyphs at those code points, so
  Word fell back or rendered tofu. Switch to Word's native bullet
  definitions: U+F0B7 in Symbol, "o" in Courier New, U+F0A7 in Wingdings.

  Also add w:contextualSpacing to list paragraphs so consecutive items
  render tight instead of inheriting the ListParagraph style's default
  before/after spacing.
</commit_message>
<xml_diff>
--- a/src/OpenXmlHtml.Tests/Samples/WordSamples.ConvertToDocx.DotNet.verified.docx
+++ b/src/OpenXmlHtml.Tests/Samples/WordSamples.ConvertToDocx.DotNet.verified.docx
@@ -34,6 +34,7 @@
           <w:ilvl w:val="0"/>
           <w:numId w:val="2"/>
         </w:numPr>
+        <w:contextualSpacing/>
       </w:pPr>
       <w:r>
         <w:t xml:space="preserve">Item one</w:t>
@@ -46,6 +47,7 @@
           <w:ilvl w:val="0"/>
           <w:numId w:val="2"/>
         </w:numPr>
+        <w:contextualSpacing/>
       </w:pPr>
       <w:r>
         <w:t xml:space="preserve">Item two</w:t>
@@ -66,7 +68,7 @@
     <p2:lvl p2:ilvl="0">
       <p2:start p2:val="1"/>
       <p2:numFmt p2:val="bullet"/>
-      <p2:lvlText p2:val="●"/>
+      <p2:lvlText p2:val=""/>
       <p2:lvlJc p2:val="left"/>
       <p2:pPr>
         <p2:ind p2:left="720" p2:hanging="360"/>
@@ -78,31 +80,31 @@
     <p2:lvl p2:ilvl="1">
       <p2:start p2:val="1"/>
       <p2:numFmt p2:val="bullet"/>
-      <p2:lvlText p2:val="○"/>
+      <p2:lvlText p2:val="o"/>
       <p2:lvlJc p2:val="left"/>
       <p2:pPr>
         <p2:ind p2:left="1440" p2:hanging="360"/>
       </p2:pPr>
       <p2:rPr>
-        <p2:rFonts p2:ascii="Symbol" p2:hAnsi="Symbol"/>
+        <p2:rFonts p2:ascii="Courier New" p2:hAnsi="Courier New"/>
       </p2:rPr>
     </p2:lvl>
     <p2:lvl p2:ilvl="2">
       <p2:start p2:val="1"/>
       <p2:numFmt p2:val="bullet"/>
-      <p2:lvlText p2:val="■"/>
+      <p2:lvlText p2:val=""/>
       <p2:lvlJc p2:val="left"/>
       <p2:pPr>
         <p2:ind p2:left="2160" p2:hanging="360"/>
       </p2:pPr>
       <p2:rPr>
-        <p2:rFonts p2:ascii="Symbol" p2:hAnsi="Symbol"/>
+        <p2:rFonts p2:ascii="Wingdings" p2:hAnsi="Wingdings"/>
       </p2:rPr>
     </p2:lvl>
     <p2:lvl p2:ilvl="3">
       <p2:start p2:val="1"/>
       <p2:numFmt p2:val="bullet"/>
-      <p2:lvlText p2:val="●"/>
+      <p2:lvlText p2:val=""/>
       <p2:lvlJc p2:val="left"/>
       <p2:pPr>
         <p2:ind p2:left="2880" p2:hanging="360"/>
@@ -114,31 +116,31 @@
     <p2:lvl p2:ilvl="4">
       <p2:start p2:val="1"/>
       <p2:numFmt p2:val="bullet"/>
-      <p2:lvlText p2:val="○"/>
+      <p2:lvlText p2:val="o"/>
       <p2:lvlJc p2:val="left"/>
       <p2:pPr>
         <p2:ind p2:left="3600" p2:hanging="360"/>
       </p2:pPr>
       <p2:rPr>
-        <p2:rFonts p2:ascii="Symbol" p2:hAnsi="Symbol"/>
+        <p2:rFonts p2:ascii="Courier New" p2:hAnsi="Courier New"/>
       </p2:rPr>
     </p2:lvl>
     <p2:lvl p2:ilvl="5">
       <p2:start p2:val="1"/>
       <p2:numFmt p2:val="bullet"/>
-      <p2:lvlText p2:val="■"/>
+      <p2:lvlText p2:val=""/>
       <p2:lvlJc p2:val="left"/>
       <p2:pPr>
         <p2:ind p2:left="4320" p2:hanging="360"/>
       </p2:pPr>
       <p2:rPr>
-        <p2:rFonts p2:ascii="Symbol" p2:hAnsi="Symbol"/>
+        <p2:rFonts p2:ascii="Wingdings" p2:hAnsi="Wingdings"/>
       </p2:rPr>
     </p2:lvl>
     <p2:lvl p2:ilvl="6">
       <p2:start p2:val="1"/>
       <p2:numFmt p2:val="bullet"/>
-      <p2:lvlText p2:val="●"/>
+      <p2:lvlText p2:val=""/>
       <p2:lvlJc p2:val="left"/>
       <p2:pPr>
         <p2:ind p2:left="5040" p2:hanging="360"/>
@@ -150,25 +152,25 @@
     <p2:lvl p2:ilvl="7">
       <p2:start p2:val="1"/>
       <p2:numFmt p2:val="bullet"/>
-      <p2:lvlText p2:val="○"/>
+      <p2:lvlText p2:val="o"/>
       <p2:lvlJc p2:val="left"/>
       <p2:pPr>
         <p2:ind p2:left="5760" p2:hanging="360"/>
       </p2:pPr>
       <p2:rPr>
-        <p2:rFonts p2:ascii="Symbol" p2:hAnsi="Symbol"/>
+        <p2:rFonts p2:ascii="Courier New" p2:hAnsi="Courier New"/>
       </p2:rPr>
     </p2:lvl>
     <p2:lvl p2:ilvl="8">
       <p2:start p2:val="1"/>
       <p2:numFmt p2:val="bullet"/>
-      <p2:lvlText p2:val="■"/>
+      <p2:lvlText p2:val=""/>
       <p2:lvlJc p2:val="left"/>
       <p2:pPr>
         <p2:ind p2:left="6480" p2:hanging="360"/>
       </p2:pPr>
       <p2:rPr>
-        <p2:rFonts p2:ascii="Symbol" p2:hAnsi="Symbol"/>
+        <p2:rFonts p2:ascii="Wingdings" p2:hAnsi="Wingdings"/>
       </p2:rPr>
     </p2:lvl>
   </abstractNum>

</xml_diff>

<commit_message>
use Symbol/Wingdings font glyphs and contextual spacing (#13)
* use Symbol/Wingdings font glyphs and contextual spacing

  Bullet levels were emitting U+25CF/U+25CB/U+25A0 with an Ascii=Symbol
  font override — the Symbol font has no glyphs at those code points, so
  Word fell back or rendered tofu. Switch to Word's native bullet
  definitions: U+F0B7 in Symbol, "o" in Courier New, U+F0A7 in Wingdings.

  Also add w:contextualSpacing to list paragraphs so consecutive items
  render tight instead of inheriting the ListParagraph style's default
  before/after spacing.

* Update Directory.Build.props
</commit_message>
<xml_diff>
--- a/src/OpenXmlHtml.Tests/Samples/WordSamples.ConvertToDocx.DotNet.verified.docx
+++ b/src/OpenXmlHtml.Tests/Samples/WordSamples.ConvertToDocx.DotNet.verified.docx
@@ -34,6 +34,7 @@
           <w:ilvl w:val="0"/>
           <w:numId w:val="2"/>
         </w:numPr>
+        <w:contextualSpacing/>
       </w:pPr>
       <w:r>
         <w:t xml:space="preserve">Item one</w:t>
@@ -46,6 +47,7 @@
           <w:ilvl w:val="0"/>
           <w:numId w:val="2"/>
         </w:numPr>
+        <w:contextualSpacing/>
       </w:pPr>
       <w:r>
         <w:t xml:space="preserve">Item two</w:t>
@@ -66,7 +68,7 @@
     <p2:lvl p2:ilvl="0">
       <p2:start p2:val="1"/>
       <p2:numFmt p2:val="bullet"/>
-      <p2:lvlText p2:val="●"/>
+      <p2:lvlText p2:val=""/>
       <p2:lvlJc p2:val="left"/>
       <p2:pPr>
         <p2:ind p2:left="720" p2:hanging="360"/>
@@ -78,31 +80,31 @@
     <p2:lvl p2:ilvl="1">
       <p2:start p2:val="1"/>
       <p2:numFmt p2:val="bullet"/>
-      <p2:lvlText p2:val="○"/>
+      <p2:lvlText p2:val="o"/>
       <p2:lvlJc p2:val="left"/>
       <p2:pPr>
         <p2:ind p2:left="1440" p2:hanging="360"/>
       </p2:pPr>
       <p2:rPr>
-        <p2:rFonts p2:ascii="Symbol" p2:hAnsi="Symbol"/>
+        <p2:rFonts p2:ascii="Courier New" p2:hAnsi="Courier New"/>
       </p2:rPr>
     </p2:lvl>
     <p2:lvl p2:ilvl="2">
       <p2:start p2:val="1"/>
       <p2:numFmt p2:val="bullet"/>
-      <p2:lvlText p2:val="■"/>
+      <p2:lvlText p2:val=""/>
       <p2:lvlJc p2:val="left"/>
       <p2:pPr>
         <p2:ind p2:left="2160" p2:hanging="360"/>
       </p2:pPr>
       <p2:rPr>
-        <p2:rFonts p2:ascii="Symbol" p2:hAnsi="Symbol"/>
+        <p2:rFonts p2:ascii="Wingdings" p2:hAnsi="Wingdings"/>
       </p2:rPr>
     </p2:lvl>
     <p2:lvl p2:ilvl="3">
       <p2:start p2:val="1"/>
       <p2:numFmt p2:val="bullet"/>
-      <p2:lvlText p2:val="●"/>
+      <p2:lvlText p2:val=""/>
       <p2:lvlJc p2:val="left"/>
       <p2:pPr>
         <p2:ind p2:left="2880" p2:hanging="360"/>
@@ -114,31 +116,31 @@
     <p2:lvl p2:ilvl="4">
       <p2:start p2:val="1"/>
       <p2:numFmt p2:val="bullet"/>
-      <p2:lvlText p2:val="○"/>
+      <p2:lvlText p2:val="o"/>
       <p2:lvlJc p2:val="left"/>
       <p2:pPr>
         <p2:ind p2:left="3600" p2:hanging="360"/>
       </p2:pPr>
       <p2:rPr>
-        <p2:rFonts p2:ascii="Symbol" p2:hAnsi="Symbol"/>
+        <p2:rFonts p2:ascii="Courier New" p2:hAnsi="Courier New"/>
       </p2:rPr>
     </p2:lvl>
     <p2:lvl p2:ilvl="5">
       <p2:start p2:val="1"/>
       <p2:numFmt p2:val="bullet"/>
-      <p2:lvlText p2:val="■"/>
+      <p2:lvlText p2:val=""/>
       <p2:lvlJc p2:val="left"/>
       <p2:pPr>
         <p2:ind p2:left="4320" p2:hanging="360"/>
       </p2:pPr>
       <p2:rPr>
-        <p2:rFonts p2:ascii="Symbol" p2:hAnsi="Symbol"/>
+        <p2:rFonts p2:ascii="Wingdings" p2:hAnsi="Wingdings"/>
       </p2:rPr>
     </p2:lvl>
     <p2:lvl p2:ilvl="6">
       <p2:start p2:val="1"/>
       <p2:numFmt p2:val="bullet"/>
-      <p2:lvlText p2:val="●"/>
+      <p2:lvlText p2:val=""/>
       <p2:lvlJc p2:val="left"/>
       <p2:pPr>
         <p2:ind p2:left="5040" p2:hanging="360"/>
@@ -150,25 +152,25 @@
     <p2:lvl p2:ilvl="7">
       <p2:start p2:val="1"/>
       <p2:numFmt p2:val="bullet"/>
-      <p2:lvlText p2:val="○"/>
+      <p2:lvlText p2:val="o"/>
       <p2:lvlJc p2:val="left"/>
       <p2:pPr>
         <p2:ind p2:left="5760" p2:hanging="360"/>
       </p2:pPr>
       <p2:rPr>
-        <p2:rFonts p2:ascii="Symbol" p2:hAnsi="Symbol"/>
+        <p2:rFonts p2:ascii="Courier New" p2:hAnsi="Courier New"/>
       </p2:rPr>
     </p2:lvl>
     <p2:lvl p2:ilvl="8">
       <p2:start p2:val="1"/>
       <p2:numFmt p2:val="bullet"/>
-      <p2:lvlText p2:val="■"/>
+      <p2:lvlText p2:val=""/>
       <p2:lvlJc p2:val="left"/>
       <p2:pPr>
         <p2:ind p2:left="6480" p2:hanging="360"/>
       </p2:pPr>
       <p2:rPr>
-        <p2:rFonts p2:ascii="Symbol" p2:hAnsi="Symbol"/>
+        <p2:rFonts p2:ascii="Wingdings" p2:hAnsi="Wingdings"/>
       </p2:rPr>
     </p2:lvl>
   </abstractNum>

</xml_diff>

<commit_message>
Halve list indents (#14)
* Halve list indents

  Bullet and numbered list levels were 720 twips (0.5") at level 0
  plus 360 per nesting level, with a 360-twip hanging indent. Halve
  both: level 0 starts at 240 twips, each nested level adds 240,
  hanging is 180.

* Update Directory.Build.props
</commit_message>
<xml_diff>
--- a/src/OpenXmlHtml.Tests/Samples/WordSamples.ConvertToDocx.DotNet.verified.docx
+++ b/src/OpenXmlHtml.Tests/Samples/WordSamples.ConvertToDocx.DotNet.verified.docx
@@ -71,7 +71,7 @@
       <p2:lvlText p2:val=""/>
       <p2:lvlJc p2:val="left"/>
       <p2:pPr>
-        <p2:ind p2:left="720" p2:hanging="360"/>
+        <p2:ind p2:left="240" p2:hanging="180"/>
       </p2:pPr>
       <p2:rPr>
         <p2:rFonts p2:ascii="Symbol" p2:hAnsi="Symbol"/>
@@ -83,7 +83,7 @@
       <p2:lvlText p2:val="o"/>
       <p2:lvlJc p2:val="left"/>
       <p2:pPr>
-        <p2:ind p2:left="1440" p2:hanging="360"/>
+        <p2:ind p2:left="480" p2:hanging="180"/>
       </p2:pPr>
       <p2:rPr>
         <p2:rFonts p2:ascii="Courier New" p2:hAnsi="Courier New"/>
@@ -95,7 +95,7 @@
       <p2:lvlText p2:val=""/>
       <p2:lvlJc p2:val="left"/>
       <p2:pPr>
-        <p2:ind p2:left="2160" p2:hanging="360"/>
+        <p2:ind p2:left="720" p2:hanging="180"/>
       </p2:pPr>
       <p2:rPr>
         <p2:rFonts p2:ascii="Wingdings" p2:hAnsi="Wingdings"/>
@@ -107,7 +107,7 @@
       <p2:lvlText p2:val=""/>
       <p2:lvlJc p2:val="left"/>
       <p2:pPr>
-        <p2:ind p2:left="2880" p2:hanging="360"/>
+        <p2:ind p2:left="960" p2:hanging="180"/>
       </p2:pPr>
       <p2:rPr>
         <p2:rFonts p2:ascii="Symbol" p2:hAnsi="Symbol"/>
@@ -119,7 +119,7 @@
       <p2:lvlText p2:val="o"/>
       <p2:lvlJc p2:val="left"/>
       <p2:pPr>
-        <p2:ind p2:left="3600" p2:hanging="360"/>
+        <p2:ind p2:left="1200" p2:hanging="180"/>
       </p2:pPr>
       <p2:rPr>
         <p2:rFonts p2:ascii="Courier New" p2:hAnsi="Courier New"/>
@@ -131,7 +131,7 @@
       <p2:lvlText p2:val=""/>
       <p2:lvlJc p2:val="left"/>
       <p2:pPr>
-        <p2:ind p2:left="4320" p2:hanging="360"/>
+        <p2:ind p2:left="1440" p2:hanging="180"/>
       </p2:pPr>
       <p2:rPr>
         <p2:rFonts p2:ascii="Wingdings" p2:hAnsi="Wingdings"/>
@@ -143,7 +143,7 @@
       <p2:lvlText p2:val=""/>
       <p2:lvlJc p2:val="left"/>
       <p2:pPr>
-        <p2:ind p2:left="5040" p2:hanging="360"/>
+        <p2:ind p2:left="1680" p2:hanging="180"/>
       </p2:pPr>
       <p2:rPr>
         <p2:rFonts p2:ascii="Symbol" p2:hAnsi="Symbol"/>
@@ -155,7 +155,7 @@
       <p2:lvlText p2:val="o"/>
       <p2:lvlJc p2:val="left"/>
       <p2:pPr>
-        <p2:ind p2:left="5760" p2:hanging="360"/>
+        <p2:ind p2:left="1920" p2:hanging="180"/>
       </p2:pPr>
       <p2:rPr>
         <p2:rFonts p2:ascii="Courier New" p2:hAnsi="Courier New"/>
@@ -167,7 +167,7 @@
       <p2:lvlText p2:val=""/>
       <p2:lvlJc p2:val="left"/>
       <p2:pPr>
-        <p2:ind p2:left="6480" p2:hanging="360"/>
+        <p2:ind p2:left="2160" p2:hanging="180"/>
       </p2:pPr>
       <p2:rPr>
         <p2:rFonts p2:ascii="Wingdings" p2:hAnsi="Wingdings"/>

</xml_diff>